<commit_message>
Aprovechamientos: ensayo de pérdidas de W-MAN, estatales en 3 meses y puestos de recargas unidos
- Manuales: ensayo de pérdidas en tandas de 6 (40 s, W-MAN); el puesto más cargado pasa a ser la pintura
- Recargas: las escuelas estatales se reparten de febrero a abril (parámetro en B49), en vez de todo en febrero
- Recargas: BC y Clase D con su equipo exclusivo dentro de los puestos de polvo; CO2 y halogenado recuperan y cargan en
  la misma máquina; descarga y carga de líquidos en un solo puesto (23 puestos)
- Corte: regenerado con los sustitutos nuevos

Co-Authored-By: Claude Opus 5.5 <noreply@anthropic.com>
Claude-Session: https://claude.ai/code/session_01E33CYXtZ2f33D1RjoRdR65
</commit_message>
<xml_diff>
--- a/salida/Esquema_de_corte_en_guillotina.docx
+++ b/salida/Esquema_de_corte_en_guillotina.docx
@@ -131,7 +131,7 @@
         </w:rPr>
         <w:t xml:space="preserve">, </w:t>
       </w:r>
-      <w:hyperlink w:history="1" r:id="rIdid919wgekc_70d-ua-zcl">
+      <w:hyperlink w:history="1" r:id="rId83x23clrxojflx1jvxems">
         <w:r>
           <w:rPr>
             <w:rFonts w:ascii="Arial" w:cs="Arial" w:eastAsia="Arial" w:hAnsi="Arial"/>
@@ -262,7 +262,7 @@
         </w:rPr>
         <w:t xml:space="preserve">, </w:t>
       </w:r>
-      <w:hyperlink w:history="1" r:id="rIdlmuopo1yr4jqfsmdcwjp6">
+      <w:hyperlink w:history="1" r:id="rIdlo5zysoxbd8f5cdgh4vih">
         <w:r>
           <w:rPr>
             <w:rFonts w:ascii="Arial" w:cs="Arial" w:eastAsia="Arial" w:hAnsi="Arial"/>
@@ -18242,7 +18242,7 @@
           <w:sz w:val="19"/>
           <w:szCs w:val="19"/>
         </w:rPr>
-        <w:t xml:space="preserve"> Todos los cuerpos de 25 kg salen en hojas P1, que llevan además 3 de 50 kg; el resto de los 50 kg sale en P3. Hojas P1 = N25 ÷ 6 y hojas P3 = (N50 − N25 ÷ 2) ÷ 6, mientras N50 sea al menos la mitad de N25 (si no, P1 = N50 ÷ 3 y el resto de los 25 kg en P4). En 2035: N25 = 777 y N50 = 1.709, así que 129,6 hojas P1 y 220,1 P3.</w:t>
+        <w:t xml:space="preserve"> Todos los cuerpos de 25 kg salen en hojas P1, que llevan además 3 de 50 kg; el resto de los 50 kg sale en P3. Hojas P1 = N25 ÷ 6 y hojas P3 = (N50 − N25 ÷ 2) ÷ 6, mientras N50 sea al menos la mitad de N25 (si no, P1 = N50 ÷ 3 y el resto de los 25 kg en P4). En 2035: N25 = 777 y N50 = 1.710, así que 129,5 hojas P1 y 220,3 P3.</w:t>
       </w:r>
     </w:p>
     <w:p>
@@ -18641,7 +18641,7 @@
                 <w:sz w:val="16"/>
                 <w:szCs w:val="16"/>
               </w:rPr>
-              <w:t xml:space="preserve">1.709</w:t>
+              <w:t xml:space="preserve">1.710</w:t>
             </w:r>
           </w:p>
         </w:tc>
@@ -18675,7 +18675,7 @@
                 <w:sz w:val="16"/>
                 <w:szCs w:val="16"/>
               </w:rPr>
-              <w:t xml:space="preserve">1.709</w:t>
+              <w:t xml:space="preserve">1.710</w:t>
             </w:r>
           </w:p>
         </w:tc>
@@ -18781,7 +18781,7 @@
                 <w:sz w:val="16"/>
                 <w:szCs w:val="16"/>
               </w:rPr>
-              <w:t xml:space="preserve">371,3</w:t>
+              <w:t xml:space="preserve">371,4</w:t>
             </w:r>
           </w:p>
         </w:tc>
@@ -18815,7 +18815,7 @@
                 <w:sz w:val="16"/>
                 <w:szCs w:val="16"/>
               </w:rPr>
-              <w:t xml:space="preserve">349,7</w:t>
+              <w:t xml:space="preserve">349,8</w:t>
             </w:r>
           </w:p>
         </w:tc>
@@ -19201,7 +19201,7 @@
                 <w:sz w:val="16"/>
                 <w:szCs w:val="16"/>
               </w:rPr>
-              <w:t xml:space="preserve">46.365</w:t>
+              <w:t xml:space="preserve">46.379</w:t>
             </w:r>
           </w:p>
         </w:tc>
@@ -19235,7 +19235,7 @@
                 <w:sz w:val="16"/>
                 <w:szCs w:val="16"/>
               </w:rPr>
-              <w:t xml:space="preserve">43.668</w:t>
+              <w:t xml:space="preserve">43.683</w:t>
             </w:r>
           </w:p>
         </w:tc>
@@ -30887,7 +30887,7 @@
                 <w:sz w:val="16"/>
                 <w:szCs w:val="16"/>
               </w:rPr>
-              <w:t xml:space="preserve">3.588</w:t>
+              <w:t xml:space="preserve">3.586</w:t>
             </w:r>
           </w:p>
         </w:tc>
@@ -30921,7 +30921,7 @@
                 <w:sz w:val="16"/>
                 <w:szCs w:val="16"/>
               </w:rPr>
-              <w:t xml:space="preserve">3.312</w:t>
+              <w:t xml:space="preserve">3.310</w:t>
             </w:r>
           </w:p>
         </w:tc>
@@ -31163,7 +31163,7 @@
                 <w:sz w:val="16"/>
                 <w:szCs w:val="16"/>
               </w:rPr>
-              <w:t xml:space="preserve">2.908</w:t>
+              <w:t xml:space="preserve">2.905</w:t>
             </w:r>
           </w:p>
         </w:tc>
@@ -31197,7 +31197,7 @@
                 <w:sz w:val="16"/>
                 <w:szCs w:val="16"/>
               </w:rPr>
-              <w:t xml:space="preserve">2.680</w:t>
+              <w:t xml:space="preserve">2.678</w:t>
             </w:r>
           </w:p>
         </w:tc>
@@ -31439,7 +31439,7 @@
                 <w:sz w:val="16"/>
                 <w:szCs w:val="16"/>
               </w:rPr>
-              <w:t xml:space="preserve">32.918</w:t>
+              <w:t xml:space="preserve">32.894</w:t>
             </w:r>
           </w:p>
         </w:tc>
@@ -31473,7 +31473,7 @@
                 <w:sz w:val="16"/>
                 <w:szCs w:val="16"/>
               </w:rPr>
-              <w:t xml:space="preserve">30.378</w:t>
+              <w:t xml:space="preserve">30.356</w:t>
             </w:r>
           </w:p>
         </w:tc>
@@ -31507,7 +31507,7 @@
                 <w:sz w:val="16"/>
                 <w:szCs w:val="16"/>
               </w:rPr>
-              <w:t xml:space="preserve">2.540</w:t>
+              <w:t xml:space="preserve">2.538</w:t>
             </w:r>
           </w:p>
         </w:tc>
@@ -31715,7 +31715,7 @@
                 <w:sz w:val="16"/>
                 <w:szCs w:val="16"/>
               </w:rPr>
-              <w:t xml:space="preserve">24.698</w:t>
+              <w:t xml:space="preserve">24.680</w:t>
             </w:r>
           </w:p>
         </w:tc>
@@ -31749,7 +31749,7 @@
                 <w:sz w:val="16"/>
                 <w:szCs w:val="16"/>
               </w:rPr>
-              <w:t xml:space="preserve">22.754</w:t>
+              <w:t xml:space="preserve">22.737</w:t>
             </w:r>
           </w:p>
         </w:tc>
@@ -31783,7 +31783,7 @@
                 <w:sz w:val="16"/>
                 <w:szCs w:val="16"/>
               </w:rPr>
-              <w:t xml:space="preserve">1.944</w:t>
+              <w:t xml:space="preserve">1.943</w:t>
             </w:r>
           </w:p>
         </w:tc>
@@ -31991,7 +31991,7 @@
                 <w:sz w:val="16"/>
                 <w:szCs w:val="16"/>
               </w:rPr>
-              <w:t xml:space="preserve">2.733</w:t>
+              <w:t xml:space="preserve">2.729</w:t>
             </w:r>
           </w:p>
         </w:tc>
@@ -32025,7 +32025,7 @@
                 <w:sz w:val="16"/>
                 <w:szCs w:val="16"/>
               </w:rPr>
-              <w:t xml:space="preserve">2.526</w:t>
+              <w:t xml:space="preserve">2.523</w:t>
             </w:r>
           </w:p>
         </w:tc>
@@ -32267,7 +32267,7 @@
                 <w:sz w:val="16"/>
                 <w:szCs w:val="16"/>
               </w:rPr>
-              <w:t xml:space="preserve">2.496</w:t>
+              <w:t xml:space="preserve">2.493</w:t>
             </w:r>
           </w:p>
         </w:tc>
@@ -32301,7 +32301,7 @@
                 <w:sz w:val="16"/>
                 <w:szCs w:val="16"/>
               </w:rPr>
-              <w:t xml:space="preserve">2.298</w:t>
+              <w:t xml:space="preserve">2.294</w:t>
             </w:r>
           </w:p>
         </w:tc>
@@ -32499,7 +32499,7 @@
                 <w:sz w:val="16"/>
                 <w:szCs w:val="16"/>
               </w:rPr>
-              <w:t xml:space="preserve">100.996</w:t>
+              <w:t xml:space="preserve">100.941</w:t>
             </w:r>
           </w:p>
         </w:tc>
@@ -32533,7 +32533,7 @@
                 <w:sz w:val="16"/>
                 <w:szCs w:val="16"/>
               </w:rPr>
-              <w:t xml:space="preserve">93.015</w:t>
+              <w:t xml:space="preserve">92.964</w:t>
             </w:r>
           </w:p>
         </w:tc>
@@ -32567,7 +32567,7 @@
                 <w:sz w:val="16"/>
                 <w:szCs w:val="16"/>
               </w:rPr>
-              <w:t xml:space="preserve">7.981</w:t>
+              <w:t xml:space="preserve">7.977</w:t>
             </w:r>
           </w:p>
         </w:tc>
@@ -32609,7 +32609,7 @@
           <w:sz w:val="19"/>
           <w:szCs w:val="19"/>
         </w:rPr>
-        <w:t xml:space="preserve"> en 2035 (USD 9.542 al precio del fleje). Pero cada golpe tiene que cortar dos discos (matriz doble) o el fleje tiene que correrse de costado entre golpes (alimentador en zigzag), y no hay cotización de ninguno de los dos. Por eso en el Excel queda en una fila (Datos: dos filas = NO); con la cotización se prende el SI y el Excel recalcula todo.</w:t>
+        <w:t xml:space="preserve"> en 2035 (USD 9.537 al precio del fleje). Pero cada golpe tiene que cortar dos discos (matriz doble) o el fleje tiene que correrse de costado entre golpes (alimentador en zigzag), y no hay cotización de ninguno de los dos. Por eso en el Excel queda en una fila (Datos: dos filas = NO); con la cotización se prende el SI y el Excel recalcula todo.</w:t>
       </w:r>
     </w:p>
     <w:p>
@@ -37687,7 +37687,7 @@
           <w:sz w:val="19"/>
           <w:szCs w:val="19"/>
         </w:rPr>
-        <w:t xml:space="preserve"> (hojas + fleje) es la que conviene de las que cortan en planta: valor actual de USD 1.108.751, contra 1.140.654 de A, 1.141.330 de B y 1.203.055 de C. La inversión de D es de USD 86.006. La hoja tendría que subir 4,0 % para que A la iguale. El detalle está en el Excel «Análisis alternativas corte chapa» (hojas Resumen y Cálculo).</w:t>
+        <w:t xml:space="preserve"> (hojas + fleje) es la que conviene de las que cortan en planta: valor actual de USD 1.107.544, contra 1.139.515 de A, 1.140.050 de B y 1.201.797 de C. La inversión de D es de USD 86.006. La hoja tendría que subir 4,0 % para que A la iguale. El detalle está en el Excel «Análisis alternativas corte chapa» (hojas Resumen y Cálculo).</w:t>
       </w:r>
     </w:p>
     <w:p>
@@ -37807,7 +37807,7 @@
         </w:numPr>
         <w:spacing w:after="40" w:before="0" w:line="276"/>
       </w:pPr>
-      <w:hyperlink w:history="1" r:id="rIdj79nw5gv3jslvseyykmxy">
+      <w:hyperlink w:history="1" r:id="rIdeopqz3ulauixaenqjvich">
         <w:r>
           <w:rPr>
             <w:rFonts w:ascii="Arial" w:cs="Arial" w:eastAsia="Arial" w:hAnsi="Arial"/>
@@ -37838,7 +37838,7 @@
         </w:numPr>
         <w:spacing w:after="40" w:before="0" w:line="276"/>
       </w:pPr>
-      <w:hyperlink w:history="1" r:id="rIdvf-fzvahuth8usd-ztctw">
+      <w:hyperlink w:history="1" r:id="rIdx28kmndk7fv51ttnehhpg">
         <w:r>
           <w:rPr>
             <w:rFonts w:ascii="Arial" w:cs="Arial" w:eastAsia="Arial" w:hAnsi="Arial"/>
@@ -37869,7 +37869,7 @@
         </w:numPr>
         <w:spacing w:after="40" w:before="0" w:line="276"/>
       </w:pPr>
-      <w:hyperlink w:history="1" r:id="rIdeskbhwazgg23pdffrm5on">
+      <w:hyperlink w:history="1" r:id="rIdvqhdtiugipb53k2z1y_bg">
         <w:r>
           <w:rPr>
             <w:rFonts w:ascii="Arial" w:cs="Arial" w:eastAsia="Arial" w:hAnsi="Arial"/>
@@ -37976,7 +37976,7 @@
         </w:numPr>
         <w:spacing w:after="40" w:before="0" w:line="276"/>
       </w:pPr>
-      <w:hyperlink w:history="1" r:id="rIdtlrd1oydd8h-2yb_ht-dv">
+      <w:hyperlink w:history="1" r:id="rIdxl1i2thupiv7ptkyh5-ib">
         <w:r>
           <w:rPr>
             <w:rFonts w:ascii="Arial" w:cs="Arial" w:eastAsia="Arial" w:hAnsi="Arial"/>
@@ -38007,7 +38007,7 @@
         </w:numPr>
         <w:spacing w:after="40" w:before="0" w:line="276"/>
       </w:pPr>
-      <w:hyperlink w:history="1" r:id="rIdtkzcmmw5acxeaopun51yv">
+      <w:hyperlink w:history="1" r:id="rIdfwinylh22jfkbyksurids">
         <w:r>
           <w:rPr>
             <w:rFonts w:ascii="Arial" w:cs="Arial" w:eastAsia="Arial" w:hAnsi="Arial"/>
@@ -38038,7 +38038,7 @@
         </w:numPr>
         <w:spacing w:after="40" w:before="0" w:line="276"/>
       </w:pPr>
-      <w:hyperlink w:history="1" r:id="rIdqsleabdepamdychfce9mm">
+      <w:hyperlink w:history="1" r:id="rIdmtmqm9qylzg_wgowrina8">
         <w:r>
           <w:rPr>
             <w:rFonts w:ascii="Arial" w:cs="Arial" w:eastAsia="Arial" w:hAnsi="Arial"/>
@@ -38069,7 +38069,7 @@
         </w:numPr>
         <w:spacing w:after="40" w:before="0" w:line="276"/>
       </w:pPr>
-      <w:hyperlink w:history="1" r:id="rIdhyexwxhgvqrionggrdr6k">
+      <w:hyperlink w:history="1" r:id="rIdzspyvqgblxkkto5zoa1jl">
         <w:r>
           <w:rPr>
             <w:rFonts w:ascii="Arial" w:cs="Arial" w:eastAsia="Arial" w:hAnsi="Arial"/>
@@ -38090,7 +38090,7 @@
         </w:rPr>
         <w:t xml:space="preserve"> y </w:t>
       </w:r>
-      <w:hyperlink w:history="1" r:id="rIdd7m6morerl_cdguq8tuxw">
+      <w:hyperlink w:history="1" r:id="rIdergev0vsqaezlbsrf17z1">
         <w:r>
           <w:rPr>
             <w:rFonts w:ascii="Arial" w:cs="Arial" w:eastAsia="Arial" w:hAnsi="Arial"/>

</xml_diff>

<commit_message>
Recargas: estacionalidad por rubro con fuentes y Excel renombrados a Aprovechamiento
- Automotor: enero y diciembre 12 %, noviembre y febrero de transición (ITV Córdoba, RTO Mendoza)
- Edificios, educación, hoteles, salud y supermercados con meses preferidos y vedados de sus pliegos, cámaras y
  manuales (peso a = 1/3, criterio); industrias sin estacionalidad
- Dimensionamiento_* pasa a Aprovechamiento_* en los archivos y en todas las referencias (Links, notas y Word)

Co-Authored-By: Claude Opus 5.5 <noreply@anthropic.com>
Claude-Session: https://claude.ai/code/session_01E33CYXtZ2f33D1RjoRdR65
</commit_message>
<xml_diff>
--- a/salida/Esquema_de_corte_en_guillotina.docx
+++ b/salida/Esquema_de_corte_en_guillotina.docx
@@ -29,7 +29,7 @@
           <w:sz w:val="20"/>
           <w:szCs w:val="20"/>
         </w:rPr>
-        <w:t xml:space="preserve">FLAMA S.A. · Cuerpos de 1 a 100 kg en hoja estándar, con dos guillotinas en serie: G1 Ermaksan CNC HGS 2600-6 (franjas) y G2 QC12Y 6 × 2500 (piezas), y discos de cúpulas y fondos en fleje. Medidas de los planos de recipiente. Números del Excel «Análisis alternativas corte chapa» y del Dimensionamiento de Manuales.</w:t>
+        <w:t xml:space="preserve">FLAMA S.A. · Cuerpos de 1 a 100 kg en hoja estándar, con dos guillotinas en serie: G1 Ermaksan CNC HGS 2600-6 (franjas) y G2 QC12Y 6 × 2500 (piezas), y discos de cúpulas y fondos en fleje. Medidas de los planos de recipiente. Números del Excel «Análisis alternativas corte chapa» y del Aprovechamiento de Manuales.</w:t>
       </w:r>
     </w:p>
     <w:p>
@@ -131,7 +131,7 @@
         </w:rPr>
         <w:t xml:space="preserve">, </w:t>
       </w:r>
-      <w:hyperlink w:history="1" r:id="rId83x23clrxojflx1jvxems">
+      <w:hyperlink w:history="1" r:id="rIdpuqe5vx-ai9myflwov7er">
         <w:r>
           <w:rPr>
             <w:rFonts w:ascii="Arial" w:cs="Arial" w:eastAsia="Arial" w:hAnsi="Arial"/>
@@ -150,7 +150,7 @@
           <w:sz w:val="19"/>
           <w:szCs w:val="19"/>
         </w:rPr>
-        <w:t xml:space="preserve">: largo de corte 2.600 mm, 6 mm de espesor, tope trasero motorizado de 1.000 mm. La ficha da 24 golpes por minuto; se toman 20, como en el Dimensionamiento de Manuales. Hace </w:t>
+        <w:t xml:space="preserve">: largo de corte 2.600 mm, 6 mm de espesor, tope trasero motorizado de 1.000 mm. La ficha da 24 golpes por minuto; se toman 20, como en el Aprovechamiento de Manuales. Hace </w:t>
       </w:r>
       <w:r>
         <w:rPr>
@@ -262,7 +262,7 @@
         </w:rPr>
         <w:t xml:space="preserve">, </w:t>
       </w:r>
-      <w:hyperlink w:history="1" r:id="rIdlo5zysoxbd8f5cdgh4vih">
+      <w:hyperlink w:history="1" r:id="rIdsqdrszqsszavmunjmzc_g">
         <w:r>
           <w:rPr>
             <w:rFonts w:ascii="Arial" w:cs="Arial" w:eastAsia="Arial" w:hAnsi="Arial"/>
@@ -4257,7 +4257,7 @@
           <w:sz w:val="16"/>
           <w:szCs w:val="16"/>
         </w:rPr>
-        <w:t xml:space="preserve">25 y 50 kg: la tabla da cada uno en su hoja. Con el corte combinado (sección 5.2), la hoja de 3,2 mm da en promedio 7,11 cuerpos, 3,00 golpes de G1 y 4,11 de G2 por hoja (plan 2035); esos son los valores que van a los Dimensionamientos.</w:t>
+        <w:t xml:space="preserve">25 y 50 kg: la tabla da cada uno en su hoja. Con el corte combinado (sección 5.2), la hoja de 3,2 mm da en promedio 7,11 cuerpos, 3,00 golpes de G1 y 4,11 de G2 por hoja (plan 2035); esos son los valores que van a los Aprovechamientos.</w:t>
       </w:r>
     </w:p>
     <w:p>
@@ -8636,7 +8636,7 @@
           <w:sz w:val="19"/>
           <w:szCs w:val="19"/>
         </w:rPr>
-        <w:t xml:space="preserve">El cuerpo de chapa se cilindra y lleva soldadura longitudinal TIG, que el caño no tenía: proceso automático en atmósfera inerte, admitido por la IRAM 3523, 3.2.4.2. Se adoptó la soldadora longitudinal Firesafer con fuente TIG (Dimensionamiento de Manuales).</w:t>
+        <w:t xml:space="preserve">El cuerpo de chapa se cilindra y lleva soldadura longitudinal TIG, que el caño no tenía: proceso automático en atmósfera inerte, admitido por la IRAM 3523, 3.2.4.2. Se adoptó la soldadora longitudinal Firesafer con fuente TIG (Aprovechamiento de Manuales).</w:t>
       </w:r>
     </w:p>
     <w:p>
@@ -18242,7 +18242,7 @@
           <w:sz w:val="19"/>
           <w:szCs w:val="19"/>
         </w:rPr>
-        <w:t xml:space="preserve"> Todos los cuerpos de 25 kg salen en hojas P1, que llevan además 3 de 50 kg; el resto de los 50 kg sale en P3. Hojas P1 = N25 ÷ 6 y hojas P3 = (N50 − N25 ÷ 2) ÷ 6, mientras N50 sea al menos la mitad de N25 (si no, P1 = N50 ÷ 3 y el resto de los 25 kg en P4). En 2035: N25 = 777 y N50 = 1.710, así que 129,5 hojas P1 y 220,3 P3.</w:t>
+        <w:t xml:space="preserve"> Todos los cuerpos de 25 kg salen en hojas P1, que llevan además 3 de 50 kg; el resto de los 50 kg sale en P3. Hojas P1 = N25 ÷ 6 y hojas P3 = (N50 − N25 ÷ 2) ÷ 6, mientras N50 sea al menos la mitad de N25 (si no, P1 = N50 ÷ 3 y el resto de los 25 kg en P4). En 2035: N25 = 777 y N50 = 1.708, así que 129,6 hojas P1 y 220,0 P3.</w:t>
       </w:r>
     </w:p>
     <w:p>
@@ -18641,7 +18641,7 @@
                 <w:sz w:val="16"/>
                 <w:szCs w:val="16"/>
               </w:rPr>
-              <w:t xml:space="preserve">1.710</w:t>
+              <w:t xml:space="preserve">1.708</w:t>
             </w:r>
           </w:p>
         </w:tc>
@@ -18675,7 +18675,7 @@
                 <w:sz w:val="16"/>
                 <w:szCs w:val="16"/>
               </w:rPr>
-              <w:t xml:space="preserve">1.710</w:t>
+              <w:t xml:space="preserve">1.708</w:t>
             </w:r>
           </w:p>
         </w:tc>
@@ -18781,7 +18781,7 @@
                 <w:sz w:val="16"/>
                 <w:szCs w:val="16"/>
               </w:rPr>
-              <w:t xml:space="preserve">371,4</w:t>
+              <w:t xml:space="preserve">371,1</w:t>
             </w:r>
           </w:p>
         </w:tc>
@@ -18815,7 +18815,7 @@
                 <w:sz w:val="16"/>
                 <w:szCs w:val="16"/>
               </w:rPr>
-              <w:t xml:space="preserve">349,8</w:t>
+              <w:t xml:space="preserve">349,5</w:t>
             </w:r>
           </w:p>
         </w:tc>
@@ -19201,7 +19201,7 @@
                 <w:sz w:val="16"/>
                 <w:szCs w:val="16"/>
               </w:rPr>
-              <w:t xml:space="preserve">46.379</w:t>
+              <w:t xml:space="preserve">46.344</w:t>
             </w:r>
           </w:p>
         </w:tc>
@@ -19235,7 +19235,7 @@
                 <w:sz w:val="16"/>
                 <w:szCs w:val="16"/>
               </w:rPr>
-              <w:t xml:space="preserve">43.683</w:t>
+              <w:t xml:space="preserve">43.647</w:t>
             </w:r>
           </w:p>
         </w:tc>
@@ -31163,7 +31163,7 @@
                 <w:sz w:val="16"/>
                 <w:szCs w:val="16"/>
               </w:rPr>
-              <w:t xml:space="preserve">2.905</w:t>
+              <w:t xml:space="preserve">2.906</w:t>
             </w:r>
           </w:p>
         </w:tc>
@@ -31197,7 +31197,7 @@
                 <w:sz w:val="16"/>
                 <w:szCs w:val="16"/>
               </w:rPr>
-              <w:t xml:space="preserve">2.678</w:t>
+              <w:t xml:space="preserve">2.679</w:t>
             </w:r>
           </w:p>
         </w:tc>
@@ -31439,7 +31439,7 @@
                 <w:sz w:val="16"/>
                 <w:szCs w:val="16"/>
               </w:rPr>
-              <w:t xml:space="preserve">32.894</w:t>
+              <w:t xml:space="preserve">32.903</w:t>
             </w:r>
           </w:p>
         </w:tc>
@@ -31473,7 +31473,7 @@
                 <w:sz w:val="16"/>
                 <w:szCs w:val="16"/>
               </w:rPr>
-              <w:t xml:space="preserve">30.356</w:t>
+              <w:t xml:space="preserve">30.364</w:t>
             </w:r>
           </w:p>
         </w:tc>
@@ -31507,7 +31507,7 @@
                 <w:sz w:val="16"/>
                 <w:szCs w:val="16"/>
               </w:rPr>
-              <w:t xml:space="preserve">2.538</w:t>
+              <w:t xml:space="preserve">2.539</w:t>
             </w:r>
           </w:p>
         </w:tc>
@@ -31715,7 +31715,7 @@
                 <w:sz w:val="16"/>
                 <w:szCs w:val="16"/>
               </w:rPr>
-              <w:t xml:space="preserve">24.680</w:t>
+              <w:t xml:space="preserve">24.686</w:t>
             </w:r>
           </w:p>
         </w:tc>
@@ -31749,7 +31749,7 @@
                 <w:sz w:val="16"/>
                 <w:szCs w:val="16"/>
               </w:rPr>
-              <w:t xml:space="preserve">22.737</w:t>
+              <w:t xml:space="preserve">22.743</w:t>
             </w:r>
           </w:p>
         </w:tc>
@@ -32499,7 +32499,7 @@
                 <w:sz w:val="16"/>
                 <w:szCs w:val="16"/>
               </w:rPr>
-              <w:t xml:space="preserve">100.941</w:t>
+              <w:t xml:space="preserve">100.957</w:t>
             </w:r>
           </w:p>
         </w:tc>
@@ -32533,7 +32533,7 @@
                 <w:sz w:val="16"/>
                 <w:szCs w:val="16"/>
               </w:rPr>
-              <w:t xml:space="preserve">92.964</w:t>
+              <w:t xml:space="preserve">92.979</w:t>
             </w:r>
           </w:p>
         </w:tc>
@@ -32567,7 +32567,7 @@
                 <w:sz w:val="16"/>
                 <w:szCs w:val="16"/>
               </w:rPr>
-              <w:t xml:space="preserve">7.977</w:t>
+              <w:t xml:space="preserve">7.978</w:t>
             </w:r>
           </w:p>
         </w:tc>
@@ -32609,7 +32609,7 @@
           <w:sz w:val="19"/>
           <w:szCs w:val="19"/>
         </w:rPr>
-        <w:t xml:space="preserve"> en 2035 (USD 9.537 al precio del fleje). Pero cada golpe tiene que cortar dos discos (matriz doble) o el fleje tiene que correrse de costado entre golpes (alimentador en zigzag), y no hay cotización de ninguno de los dos. Por eso en el Excel queda en una fila (Datos: dos filas = NO); con la cotización se prende el SI y el Excel recalcula todo.</w:t>
+        <w:t xml:space="preserve"> en 2035 (USD 9.539 al precio del fleje). Pero cada golpe tiene que cortar dos discos (matriz doble) o el fleje tiene que correrse de costado entre golpes (alimentador en zigzag), y no hay cotización de ninguno de los dos. Por eso en el Excel queda en una fila (Datos: dos filas = NO); con la cotización se prende el SI y el Excel recalcula todo.</w:t>
       </w:r>
     </w:p>
     <w:p>
@@ -35629,7 +35629,7 @@
           <w:sz w:val="19"/>
           <w:szCs w:val="19"/>
         </w:rPr>
-        <w:t xml:space="preserve">En el Dimensionamiento de Manuales, la carga de carros se pasa a unidades equivalentes de manuales (tiempo de carros ÷ tiempo tipo) y se suma mes a mes en los puestos de G1 y G2 (hojas «Demanda puesto»). La G1 suma además las tiras de los accesorios de carros (8,6 min por día en el pico, W-CAR). Resultado:</w:t>
+        <w:t xml:space="preserve">En el Aprovechamiento de Manuales, la carga de carros se pasa a unidades equivalentes de manuales (tiempo de carros ÷ tiempo tipo) y se suma mes a mes en los puestos de G1 y G2 (hojas «Demanda puesto»). La G1 suma además las tiras de los accesorios de carros (8,6 min por día en el pico, W-CAR). Resultado:</w:t>
       </w:r>
     </w:p>
     <w:tbl>
@@ -37687,7 +37687,7 @@
           <w:sz w:val="19"/>
           <w:szCs w:val="19"/>
         </w:rPr>
-        <w:t xml:space="preserve"> (hojas + fleje) es la que conviene de las que cortan en planta: valor actual de USD 1.107.544, contra 1.139.515 de A, 1.140.050 de B y 1.201.797 de C. La inversión de D es de USD 86.006. La hoja tendría que subir 4,0 % para que A la iguale. El detalle está en el Excel «Análisis alternativas corte chapa» (hojas Resumen y Cálculo).</w:t>
+        <w:t xml:space="preserve"> (hojas + fleje) es la que conviene de las que cortan en planta: valor actual de USD 1.107.927, contra 1.139.876 de A, 1.140.454 de B y 1.202.188 de C. La inversión de D es de USD 86.006. La hoja tendría que subir 4,0 % para que A la iguale. El detalle está en el Excel «Análisis alternativas corte chapa» (hojas Resumen y Cálculo).</w:t>
       </w:r>
     </w:p>
     <w:p>
@@ -37807,7 +37807,7 @@
         </w:numPr>
         <w:spacing w:after="40" w:before="0" w:line="276"/>
       </w:pPr>
-      <w:hyperlink w:history="1" r:id="rIdeopqz3ulauixaenqjvich">
+      <w:hyperlink w:history="1" r:id="rIdjvpudksg1mflcdlam6s5d">
         <w:r>
           <w:rPr>
             <w:rFonts w:ascii="Arial" w:cs="Arial" w:eastAsia="Arial" w:hAnsi="Arial"/>
@@ -37838,7 +37838,7 @@
         </w:numPr>
         <w:spacing w:after="40" w:before="0" w:line="276"/>
       </w:pPr>
-      <w:hyperlink w:history="1" r:id="rIdx28kmndk7fv51ttnehhpg">
+      <w:hyperlink w:history="1" r:id="rIdn_4c0_gqeic5phc0grpuy">
         <w:r>
           <w:rPr>
             <w:rFonts w:ascii="Arial" w:cs="Arial" w:eastAsia="Arial" w:hAnsi="Arial"/>
@@ -37869,7 +37869,7 @@
         </w:numPr>
         <w:spacing w:after="40" w:before="0" w:line="276"/>
       </w:pPr>
-      <w:hyperlink w:history="1" r:id="rIdvqhdtiugipb53k2z1y_bg">
+      <w:hyperlink w:history="1" r:id="rId3soihxmvsd4ycfv9p2frd">
         <w:r>
           <w:rPr>
             <w:rFonts w:ascii="Arial" w:cs="Arial" w:eastAsia="Arial" w:hAnsi="Arial"/>
@@ -37926,7 +37926,7 @@
           <w:sz w:val="19"/>
           <w:szCs w:val="19"/>
         </w:rPr>
-        <w:t xml:space="preserve">Dimensionamiento de Manuales del grupo: golpes por minuto de G1 y G2; soldadora longitudinal TIG Firesafer para el 1 kg.</w:t>
+        <w:t xml:space="preserve">Aprovechamiento de Manuales del grupo: golpes por minuto de G1 y G2; soldadora longitudinal TIG Firesafer para el 1 kg.</w:t>
       </w:r>
     </w:p>
     <w:p>
@@ -37976,7 +37976,7 @@
         </w:numPr>
         <w:spacing w:after="40" w:before="0" w:line="276"/>
       </w:pPr>
-      <w:hyperlink w:history="1" r:id="rIdxl1i2thupiv7ptkyh5-ib">
+      <w:hyperlink w:history="1" r:id="rIdxjoniwkyk-fc1_wc4s2je">
         <w:r>
           <w:rPr>
             <w:rFonts w:ascii="Arial" w:cs="Arial" w:eastAsia="Arial" w:hAnsi="Arial"/>
@@ -38007,7 +38007,7 @@
         </w:numPr>
         <w:spacing w:after="40" w:before="0" w:line="276"/>
       </w:pPr>
-      <w:hyperlink w:history="1" r:id="rIdfwinylh22jfkbyksurids">
+      <w:hyperlink w:history="1" r:id="rIdgs2we5dlt1xah8lj3onq2">
         <w:r>
           <w:rPr>
             <w:rFonts w:ascii="Arial" w:cs="Arial" w:eastAsia="Arial" w:hAnsi="Arial"/>
@@ -38038,7 +38038,7 @@
         </w:numPr>
         <w:spacing w:after="40" w:before="0" w:line="276"/>
       </w:pPr>
-      <w:hyperlink w:history="1" r:id="rIdmtmqm9qylzg_wgowrina8">
+      <w:hyperlink w:history="1" r:id="rIdu9bheb6ja8mfygzgc3odn">
         <w:r>
           <w:rPr>
             <w:rFonts w:ascii="Arial" w:cs="Arial" w:eastAsia="Arial" w:hAnsi="Arial"/>
@@ -38069,7 +38069,7 @@
         </w:numPr>
         <w:spacing w:after="40" w:before="0" w:line="276"/>
       </w:pPr>
-      <w:hyperlink w:history="1" r:id="rIdzspyvqgblxkkto5zoa1jl">
+      <w:hyperlink w:history="1" r:id="rId9wskgjtws6tzkdabmgdgi">
         <w:r>
           <w:rPr>
             <w:rFonts w:ascii="Arial" w:cs="Arial" w:eastAsia="Arial" w:hAnsi="Arial"/>
@@ -38090,7 +38090,7 @@
         </w:rPr>
         <w:t xml:space="preserve"> y </w:t>
       </w:r>
-      <w:hyperlink w:history="1" r:id="rIdergev0vsqaezlbsrf17z1">
+      <w:hyperlink w:history="1" r:id="rId_vufs3jba0cn4ycqgutqd">
         <w:r>
           <w:rPr>
             <w:rFonts w:ascii="Arial" w:cs="Arial" w:eastAsia="Arial" w:hAnsi="Arial"/>

</xml_diff>